<commit_message>
chore: sync upstream scoring/aux targets and purge old interference residue
Adopt official L3/L5 aux-station task defs, offline score/regen tooling, and remove stale June recordings plus CDP/ms debug scripts from the tracked tree.

Co-authored-by: Cursor <cursoragent@cursor.com>
</commit_message>
<xml_diff>
--- a/JCIIOT/sop+prompt/JCIIOT 2026 case 3 SOP.docx
+++ b/JCIIOT/sop+prompt/JCIIOT 2026 case 3 SOP.docx
@@ -183,7 +183,7 @@
     <w:p>
       <w:r>
         <w:pict w14:anchorId="5973D60F">
-          <v:rect id="_x0000_i1067" style="width:0;height:1.5pt" o:hralign="center" o:hrstd="t" o:hr="t" fillcolor="#a0a0a0" stroked="f"/>
+          <v:rect id="_x0000_i1025" style="width:0;height:1.5pt" o:hralign="center" o:hrstd="t" o:hr="t" fillcolor="#a0a0a0" stroked="f"/>
         </w:pict>
       </w:r>
     </w:p>
@@ -225,7 +225,7 @@
     <w:p>
       <w:r>
         <w:pict w14:anchorId="4BE7DE2E">
-          <v:rect id="_x0000_i1068" style="width:0;height:1.5pt" o:hralign="center" o:hrstd="t" o:hr="t" fillcolor="#a0a0a0" stroked="f"/>
+          <v:rect id="_x0000_i1026" style="width:0;height:1.5pt" o:hralign="center" o:hrstd="t" o:hr="t" fillcolor="#a0a0a0" stroked="f"/>
         </w:pict>
       </w:r>
     </w:p>
@@ -337,7 +337,7 @@
       <w:r>
         <w:lastRenderedPageBreak/>
         <w:pict w14:anchorId="194377A9">
-          <v:rect id="_x0000_i1069" style="width:0;height:1.5pt" o:hralign="center" o:hrstd="t" o:hr="t" fillcolor="#a0a0a0" stroked="f"/>
+          <v:rect id="_x0000_i1027" style="width:0;height:1.5pt" o:hralign="center" o:hrstd="t" o:hr="t" fillcolor="#a0a0a0" stroked="f"/>
         </w:pict>
       </w:r>
     </w:p>
@@ -489,7 +489,7 @@
     <w:p>
       <w:r>
         <w:pict w14:anchorId="4C5245EA">
-          <v:rect id="_x0000_i1070" style="width:0;height:1.5pt" o:hralign="center" o:hrstd="t" o:hr="t" fillcolor="#a0a0a0" stroked="f"/>
+          <v:rect id="_x0000_i1028" style="width:0;height:1.5pt" o:hralign="center" o:hrstd="t" o:hr="t" fillcolor="#a0a0a0" stroked="f"/>
         </w:pict>
       </w:r>
     </w:p>
@@ -642,7 +642,16 @@
         </w:numPr>
       </w:pPr>
       <w:r>
-        <w:t>Visually inspect the area around Pick Station 2.</w:t>
+        <w:t xml:space="preserve">Visually inspect the area around Pick Station </w:t>
+      </w:r>
+      <w:r>
+        <w:rPr>
+          <w:rFonts w:hint="eastAsia"/>
+        </w:rPr>
+        <w:t>1</w:t>
+      </w:r>
+      <w:r>
+        <w:t>.</w:t>
       </w:r>
     </w:p>
     <w:p>
@@ -1049,7 +1058,16 @@
         </w:numPr>
       </w:pPr>
       <w:r>
-        <w:t>Calculate the optimal path from Pick Station 2 to Place Station 3.</w:t>
+        <w:t xml:space="preserve">Calculate the optimal path from Pick Station </w:t>
+      </w:r>
+      <w:r>
+        <w:rPr>
+          <w:rFonts w:hint="eastAsia"/>
+        </w:rPr>
+        <w:t>1</w:t>
+      </w:r>
+      <w:r>
+        <w:t xml:space="preserve"> to Place Station 3.</w:t>
       </w:r>
     </w:p>
     <w:p>
@@ -1794,6 +1812,658 @@
     <w:p>
       <w:r>
         <w:pict w14:anchorId="1F855D8C">
+          <v:rect id="_x0000_i1029" style="width:0;height:1.5pt" o:hralign="center" o:hrstd="t" o:hr="t" fillcolor="#a0a0a0" stroked="f"/>
+        </w:pict>
+      </w:r>
+    </w:p>
+    <w:p>
+      <w:r>
+        <w:rPr>
+          <w:b/>
+          <w:bCs/>
+        </w:rPr>
+        <w:t>4.5 Phase Five: Cyclic Operation (if applicable)</w:t>
+      </w:r>
+      <w:r>
+        <w:br/>
+      </w:r>
+      <w:r>
+        <w:rPr>
+          <w:b/>
+          <w:bCs/>
+        </w:rPr>
+        <w:t>Operation Condition:</w:t>
+      </w:r>
+      <w:r>
+        <w:t> When the task order requires handling multiple items.</w:t>
+      </w:r>
+      <w:r>
+        <w:br/>
+      </w:r>
+      <w:r>
+        <w:rPr>
+          <w:b/>
+          <w:bCs/>
+        </w:rPr>
+        <w:t>Operation Steps:</w:t>
+      </w:r>
+    </w:p>
+    <w:p>
+      <w:pPr>
+        <w:numPr>
+          <w:ilvl w:val="0"/>
+          <w:numId w:val="23"/>
+        </w:numPr>
+      </w:pPr>
+      <w:r>
+        <w:t>Return to Step 4.1 and repeat Phases Two through Four.</w:t>
+      </w:r>
+    </w:p>
+    <w:p>
+      <w:pPr>
+        <w:numPr>
+          <w:ilvl w:val="0"/>
+          <w:numId w:val="23"/>
+        </w:numPr>
+      </w:pPr>
+      <w:r>
+        <w:t>Each cycle must fully execute all verification steps.</w:t>
+      </w:r>
+    </w:p>
+    <w:p>
+      <w:pPr>
+        <w:numPr>
+          <w:ilvl w:val="0"/>
+          <w:numId w:val="23"/>
+        </w:numPr>
+      </w:pPr>
+      <w:r>
+        <w:t>Record the completion status of each transfer.</w:t>
+      </w:r>
+    </w:p>
+    <w:p>
+      <w:r>
+        <w:pict w14:anchorId="088F4640">
+          <v:rect id="_x0000_i1030" style="width:0;height:1.5pt" o:hralign="center" o:hrstd="t" o:hr="t" fillcolor="#a0a0a0" stroked="f"/>
+        </w:pict>
+      </w:r>
+    </w:p>
+    <w:p>
+      <w:r>
+        <w:rPr>
+          <w:b/>
+          <w:bCs/>
+        </w:rPr>
+        <w:t>4.6 Phase Six: Task Completion and Return to Home</w:t>
+      </w:r>
+      <w:r>
+        <w:br/>
+      </w:r>
+      <w:r>
+        <w:rPr>
+          <w:b/>
+          <w:bCs/>
+        </w:rPr>
+        <w:t>Operation Steps:</w:t>
+      </w:r>
+    </w:p>
+    <w:p>
+      <w:r>
+        <w:rPr>
+          <w:b/>
+          <w:bCs/>
+        </w:rPr>
+        <w:t>Step 6.1 - Task Completion Confirmation</w:t>
+      </w:r>
+    </w:p>
+    <w:p>
+      <w:pPr>
+        <w:numPr>
+          <w:ilvl w:val="0"/>
+          <w:numId w:val="24"/>
+        </w:numPr>
+      </w:pPr>
+      <w:r>
+        <w:t>Verify the quantity transported against the task order requirements.</w:t>
+      </w:r>
+    </w:p>
+    <w:p>
+      <w:pPr>
+        <w:numPr>
+          <w:ilvl w:val="0"/>
+          <w:numId w:val="24"/>
+        </w:numPr>
+      </w:pPr>
+      <w:r>
+        <w:t>Confirm all materials have been correctly placed.</w:t>
+      </w:r>
+    </w:p>
+    <w:p>
+      <w:pPr>
+        <w:numPr>
+          <w:ilvl w:val="0"/>
+          <w:numId w:val="24"/>
+        </w:numPr>
+      </w:pPr>
+      <w:r>
+        <w:t>Check for any missing materials.</w:t>
+      </w:r>
+    </w:p>
+    <w:p>
+      <w:r>
+        <w:rPr>
+          <w:b/>
+          <w:bCs/>
+        </w:rPr>
+        <w:lastRenderedPageBreak/>
+        <w:t>Step 6.2 - Data Recording</w:t>
+      </w:r>
+    </w:p>
+    <w:p>
+      <w:pPr>
+        <w:numPr>
+          <w:ilvl w:val="0"/>
+          <w:numId w:val="25"/>
+        </w:numPr>
+      </w:pPr>
+      <w:r>
+        <w:t>Record task completion time.</w:t>
+      </w:r>
+    </w:p>
+    <w:p>
+      <w:pPr>
+        <w:numPr>
+          <w:ilvl w:val="0"/>
+          <w:numId w:val="25"/>
+        </w:numPr>
+      </w:pPr>
+      <w:r>
+        <w:t>Fill in the operation record sheet.</w:t>
+      </w:r>
+    </w:p>
+    <w:p>
+      <w:pPr>
+        <w:numPr>
+          <w:ilvl w:val="0"/>
+          <w:numId w:val="25"/>
+        </w:numPr>
+      </w:pPr>
+      <w:r>
+        <w:t>Record abnormal situations (if any).</w:t>
+      </w:r>
+    </w:p>
+    <w:p>
+      <w:r>
+        <w:rPr>
+          <w:b/>
+          <w:bCs/>
+        </w:rPr>
+        <w:t>Step 6.3 - Equipment Return to Home</w:t>
+      </w:r>
+    </w:p>
+    <w:p>
+      <w:pPr>
+        <w:numPr>
+          <w:ilvl w:val="0"/>
+          <w:numId w:val="26"/>
+        </w:numPr>
+      </w:pPr>
+      <w:r>
+        <w:t>Navigate to the designated standby area.</w:t>
+      </w:r>
+    </w:p>
+    <w:p>
+      <w:pPr>
+        <w:numPr>
+          <w:ilvl w:val="0"/>
+          <w:numId w:val="26"/>
+        </w:numPr>
+      </w:pPr>
+      <w:r>
+        <w:t>Enter standby mode.</w:t>
+      </w:r>
+    </w:p>
+    <w:p>
+      <w:pPr>
+        <w:numPr>
+          <w:ilvl w:val="0"/>
+          <w:numId w:val="26"/>
+        </w:numPr>
+      </w:pPr>
+      <w:r>
+        <w:t>Await the next operation instruction.</w:t>
+      </w:r>
+    </w:p>
+    <w:p>
+      <w:r>
+        <w:pict w14:anchorId="7B86B474">
+          <v:rect id="_x0000_i1031" style="width:0;height:1.5pt" o:hralign="center" o:hrstd="t" o:hr="t" fillcolor="#a0a0a0" stroked="f"/>
+        </w:pict>
+      </w:r>
+    </w:p>
+    <w:p>
+      <w:r>
+        <w:rPr>
+          <w:b/>
+          <w:bCs/>
+        </w:rPr>
+        <w:t>5. Anomaly Handling Procedures</w:t>
+      </w:r>
+    </w:p>
+    <w:p>
+      <w:r>
+        <w:rPr>
+          <w:b/>
+          <w:bCs/>
+        </w:rPr>
+        <w:t>5.1 Collision Event Handling</w:t>
+      </w:r>
+      <w:r>
+        <w:br/>
+      </w:r>
+      <w:proofErr w:type="spellStart"/>
+      <w:r>
+        <w:rPr>
+          <w:b/>
+          <w:bCs/>
+        </w:rPr>
+        <w:t>Handling</w:t>
+      </w:r>
+      <w:proofErr w:type="spellEnd"/>
+      <w:r>
+        <w:rPr>
+          <w:b/>
+          <w:bCs/>
+        </w:rPr>
+        <w:t xml:space="preserve"> Procedure:</w:t>
+      </w:r>
+    </w:p>
+    <w:p>
+      <w:pPr>
+        <w:numPr>
+          <w:ilvl w:val="0"/>
+          <w:numId w:val="27"/>
+        </w:numPr>
+      </w:pPr>
+      <w:r>
+        <w:rPr>
+          <w:b/>
+          <w:bCs/>
+        </w:rPr>
+        <w:t>Immediate Stop</w:t>
+      </w:r>
+      <w:r>
+        <w:t> - All movements cease immediately.</w:t>
+      </w:r>
+    </w:p>
+    <w:p>
+      <w:pPr>
+        <w:numPr>
+          <w:ilvl w:val="0"/>
+          <w:numId w:val="27"/>
+        </w:numPr>
+      </w:pPr>
+      <w:r>
+        <w:rPr>
+          <w:b/>
+          <w:bCs/>
+        </w:rPr>
+        <w:t>Assess Damage</w:t>
+      </w:r>
+      <w:r>
+        <w:t> - Check equipment and material status.</w:t>
+      </w:r>
+    </w:p>
+    <w:p>
+      <w:pPr>
+        <w:numPr>
+          <w:ilvl w:val="0"/>
+          <w:numId w:val="27"/>
+        </w:numPr>
+      </w:pPr>
+      <w:r>
+        <w:rPr>
+          <w:b/>
+          <w:bCs/>
+        </w:rPr>
+        <w:t>Record Event</w:t>
+      </w:r>
+      <w:r>
+        <w:t> - Fill out an anomaly report form.</w:t>
+      </w:r>
+    </w:p>
+    <w:p>
+      <w:pPr>
+        <w:numPr>
+          <w:ilvl w:val="0"/>
+          <w:numId w:val="27"/>
+        </w:numPr>
+      </w:pPr>
+      <w:r>
+        <w:rPr>
+          <w:b/>
+          <w:bCs/>
+        </w:rPr>
+        <w:t>Report to Supervisor</w:t>
+      </w:r>
+      <w:r>
+        <w:t> - Immediately notify the site supervisor.</w:t>
+      </w:r>
+    </w:p>
+    <w:p>
+      <w:pPr>
+        <w:numPr>
+          <w:ilvl w:val="0"/>
+          <w:numId w:val="27"/>
+        </w:numPr>
+      </w:pPr>
+      <w:r>
+        <w:rPr>
+          <w:b/>
+          <w:bCs/>
+        </w:rPr>
+        <w:t>Await Instructions</w:t>
+      </w:r>
+      <w:r>
+        <w:t> - Continue or stop operations based on supervisor's instructions.</w:t>
+      </w:r>
+    </w:p>
+    <w:p>
+      <w:r>
+        <w:rPr>
+          <w:b/>
+          <w:bCs/>
+        </w:rPr>
+        <w:t>5.2 Material Drop Handling</w:t>
+      </w:r>
+      <w:r>
+        <w:br/>
+      </w:r>
+      <w:proofErr w:type="spellStart"/>
+      <w:r>
+        <w:rPr>
+          <w:b/>
+          <w:bCs/>
+        </w:rPr>
+        <w:t>Handling</w:t>
+      </w:r>
+      <w:proofErr w:type="spellEnd"/>
+      <w:r>
+        <w:rPr>
+          <w:b/>
+          <w:bCs/>
+        </w:rPr>
+        <w:t xml:space="preserve"> Procedure:</w:t>
+      </w:r>
+    </w:p>
+    <w:p>
+      <w:pPr>
+        <w:numPr>
+          <w:ilvl w:val="0"/>
+          <w:numId w:val="28"/>
+        </w:numPr>
+      </w:pPr>
+      <w:r>
+        <w:rPr>
+          <w:b/>
+          <w:bCs/>
+        </w:rPr>
+        <w:t>Stop Operation</w:t>
+      </w:r>
+      <w:r>
+        <w:t> - Suspend the current transfer task.</w:t>
+      </w:r>
+    </w:p>
+    <w:p>
+      <w:pPr>
+        <w:numPr>
+          <w:ilvl w:val="0"/>
+          <w:numId w:val="28"/>
+        </w:numPr>
+      </w:pPr>
+      <w:r>
+        <w:rPr>
+          <w:b/>
+          <w:bCs/>
+        </w:rPr>
+        <w:t>Assess Situation</w:t>
+      </w:r>
+      <w:r>
+        <w:t> - Determine if safe re-grasping is possible.</w:t>
+      </w:r>
+    </w:p>
+    <w:p>
+      <w:pPr>
+        <w:numPr>
+          <w:ilvl w:val="0"/>
+          <w:numId w:val="28"/>
+        </w:numPr>
+      </w:pPr>
+      <w:r>
+        <w:rPr>
+          <w:b/>
+          <w:bCs/>
+        </w:rPr>
+        <w:t>If Conditions Allow</w:t>
+      </w:r>
+      <w:r>
+        <w:t> - Perform re-grasping operation.</w:t>
+      </w:r>
+    </w:p>
+    <w:p>
+      <w:pPr>
+        <w:numPr>
+          <w:ilvl w:val="0"/>
+          <w:numId w:val="28"/>
+        </w:numPr>
+      </w:pPr>
+      <w:r>
+        <w:rPr>
+          <w:b/>
+          <w:bCs/>
+        </w:rPr>
+        <w:t>If Conditions Do Not Allow</w:t>
+      </w:r>
+      <w:r>
+        <w:t> - Report anomaly, await manual handling.</w:t>
+      </w:r>
+    </w:p>
+    <w:p>
+      <w:pPr>
+        <w:numPr>
+          <w:ilvl w:val="0"/>
+          <w:numId w:val="28"/>
+        </w:numPr>
+      </w:pPr>
+      <w:r>
+        <w:rPr>
+          <w:b/>
+          <w:bCs/>
+        </w:rPr>
+        <w:t>Record Event</w:t>
+      </w:r>
+      <w:r>
+        <w:t> - Fill out an anomaly report form.</w:t>
+      </w:r>
+    </w:p>
+    <w:p>
+      <w:r>
+        <w:rPr>
+          <w:b/>
+          <w:bCs/>
+        </w:rPr>
+        <w:t>5.3 Path Obstruction Handling</w:t>
+      </w:r>
+      <w:r>
+        <w:br/>
+      </w:r>
+      <w:proofErr w:type="spellStart"/>
+      <w:r>
+        <w:rPr>
+          <w:b/>
+          <w:bCs/>
+        </w:rPr>
+        <w:t>Handling</w:t>
+      </w:r>
+      <w:proofErr w:type="spellEnd"/>
+      <w:r>
+        <w:rPr>
+          <w:b/>
+          <w:bCs/>
+        </w:rPr>
+        <w:t xml:space="preserve"> Procedure:</w:t>
+      </w:r>
+    </w:p>
+    <w:p>
+      <w:pPr>
+        <w:numPr>
+          <w:ilvl w:val="0"/>
+          <w:numId w:val="29"/>
+        </w:numPr>
+      </w:pPr>
+      <w:r>
+        <w:rPr>
+          <w:b/>
+          <w:bCs/>
+        </w:rPr>
+        <w:lastRenderedPageBreak/>
+        <w:t>Stop Advance</w:t>
+      </w:r>
+      <w:r>
+        <w:t> - Stop at a safe distance.</w:t>
+      </w:r>
+    </w:p>
+    <w:p>
+      <w:pPr>
+        <w:numPr>
+          <w:ilvl w:val="0"/>
+          <w:numId w:val="29"/>
+        </w:numPr>
+      </w:pPr>
+      <w:r>
+        <w:rPr>
+          <w:b/>
+          <w:bCs/>
+        </w:rPr>
+        <w:t>Re-plan</w:t>
+      </w:r>
+      <w:r>
+        <w:t> - Calculate an alternative path.</w:t>
+      </w:r>
+    </w:p>
+    <w:p>
+      <w:pPr>
+        <w:numPr>
+          <w:ilvl w:val="0"/>
+          <w:numId w:val="29"/>
+        </w:numPr>
+      </w:pPr>
+      <w:r>
+        <w:rPr>
+          <w:b/>
+          <w:bCs/>
+        </w:rPr>
+        <w:t>Cannot Detour</w:t>
+      </w:r>
+      <w:r>
+        <w:t> - Report anomaly, await obstacle clearance.</w:t>
+      </w:r>
+    </w:p>
+    <w:p>
+      <w:pPr>
+        <w:numPr>
+          <w:ilvl w:val="0"/>
+          <w:numId w:val="29"/>
+        </w:numPr>
+      </w:pPr>
+      <w:r>
+        <w:rPr>
+          <w:b/>
+          <w:bCs/>
+        </w:rPr>
+        <w:t>Resume Operation</w:t>
+      </w:r>
+      <w:r>
+        <w:t> - Continue after obstacle is cleared.</w:t>
+      </w:r>
+    </w:p>
+    <w:p>
+      <w:r>
+        <w:rPr>
+          <w:b/>
+          <w:bCs/>
+        </w:rPr>
+        <w:t>5.4 SOP Discrepancy with Reality</w:t>
+      </w:r>
+      <w:r>
+        <w:br/>
+      </w:r>
+      <w:r>
+        <w:rPr>
+          <w:b/>
+          <w:bCs/>
+        </w:rPr>
+        <w:t>Handling Procedure:</w:t>
+      </w:r>
+    </w:p>
+    <w:p>
+      <w:pPr>
+        <w:numPr>
+          <w:ilvl w:val="0"/>
+          <w:numId w:val="30"/>
+        </w:numPr>
+      </w:pPr>
+      <w:r>
+        <w:t>Immediately stop operations.</w:t>
+      </w:r>
+    </w:p>
+    <w:p>
+      <w:pPr>
+        <w:numPr>
+          <w:ilvl w:val="0"/>
+          <w:numId w:val="30"/>
+        </w:numPr>
+      </w:pPr>
+      <w:r>
+        <w:t>Report to the site supervisor.</w:t>
+      </w:r>
+    </w:p>
+    <w:p>
+      <w:pPr>
+        <w:numPr>
+          <w:ilvl w:val="0"/>
+          <w:numId w:val="30"/>
+        </w:numPr>
+      </w:pPr>
+      <w:r>
+        <w:t>Describe discrepancies in detail.</w:t>
+      </w:r>
+    </w:p>
+    <w:p>
+      <w:pPr>
+        <w:numPr>
+          <w:ilvl w:val="0"/>
+          <w:numId w:val="30"/>
+        </w:numPr>
+      </w:pPr>
+      <w:r>
+        <w:t>Await SOP update or special instructions.</w:t>
+      </w:r>
+    </w:p>
+    <w:p>
+      <w:pPr>
+        <w:numPr>
+          <w:ilvl w:val="0"/>
+          <w:numId w:val="30"/>
+        </w:numPr>
+      </w:pPr>
+      <w:r>
+        <w:t>Do not unilaterally change operational procedures.</w:t>
+      </w:r>
+    </w:p>
+    <w:p>
+      <w:r>
+        <w:pict w14:anchorId="79C5B09C">
           <v:rect id="_x0000_i1032" style="width:0;height:1.5pt" o:hralign="center" o:hrstd="t" o:hr="t" fillcolor="#a0a0a0" stroked="f"/>
         </w:pict>
       </w:r>
@@ -1804,658 +2474,6 @@
           <w:b/>
           <w:bCs/>
         </w:rPr>
-        <w:t>4.5 Phase Five: Cyclic Operation (if applicable)</w:t>
-      </w:r>
-      <w:r>
-        <w:br/>
-      </w:r>
-      <w:r>
-        <w:rPr>
-          <w:b/>
-          <w:bCs/>
-        </w:rPr>
-        <w:t>Operation Condition:</w:t>
-      </w:r>
-      <w:r>
-        <w:t> When the task order requires handling multiple items.</w:t>
-      </w:r>
-      <w:r>
-        <w:br/>
-      </w:r>
-      <w:r>
-        <w:rPr>
-          <w:b/>
-          <w:bCs/>
-        </w:rPr>
-        <w:t>Operation Steps:</w:t>
-      </w:r>
-    </w:p>
-    <w:p>
-      <w:pPr>
-        <w:numPr>
-          <w:ilvl w:val="0"/>
-          <w:numId w:val="23"/>
-        </w:numPr>
-      </w:pPr>
-      <w:r>
-        <w:t>Return to Step 4.1 and repeat Phases Two through Four.</w:t>
-      </w:r>
-    </w:p>
-    <w:p>
-      <w:pPr>
-        <w:numPr>
-          <w:ilvl w:val="0"/>
-          <w:numId w:val="23"/>
-        </w:numPr>
-      </w:pPr>
-      <w:r>
-        <w:t>Each cycle must fully execute all verification steps.</w:t>
-      </w:r>
-    </w:p>
-    <w:p>
-      <w:pPr>
-        <w:numPr>
-          <w:ilvl w:val="0"/>
-          <w:numId w:val="23"/>
-        </w:numPr>
-      </w:pPr>
-      <w:r>
-        <w:t>Record the completion status of each transfer.</w:t>
-      </w:r>
-    </w:p>
-    <w:p>
-      <w:r>
-        <w:pict w14:anchorId="088F4640">
-          <v:rect id="_x0000_i1108" style="width:0;height:1.5pt" o:hralign="center" o:hrstd="t" o:hr="t" fillcolor="#a0a0a0" stroked="f"/>
-        </w:pict>
-      </w:r>
-    </w:p>
-    <w:p>
-      <w:r>
-        <w:rPr>
-          <w:b/>
-          <w:bCs/>
-        </w:rPr>
-        <w:t>4.6 Phase Six: Task Completion and Return to Home</w:t>
-      </w:r>
-      <w:r>
-        <w:br/>
-      </w:r>
-      <w:r>
-        <w:rPr>
-          <w:b/>
-          <w:bCs/>
-        </w:rPr>
-        <w:t>Operation Steps:</w:t>
-      </w:r>
-    </w:p>
-    <w:p>
-      <w:r>
-        <w:rPr>
-          <w:b/>
-          <w:bCs/>
-        </w:rPr>
-        <w:t>Step 6.1 - Task Completion Confirmation</w:t>
-      </w:r>
-    </w:p>
-    <w:p>
-      <w:pPr>
-        <w:numPr>
-          <w:ilvl w:val="0"/>
-          <w:numId w:val="24"/>
-        </w:numPr>
-      </w:pPr>
-      <w:r>
-        <w:t>Verify the quantity transported against the task order requirements.</w:t>
-      </w:r>
-    </w:p>
-    <w:p>
-      <w:pPr>
-        <w:numPr>
-          <w:ilvl w:val="0"/>
-          <w:numId w:val="24"/>
-        </w:numPr>
-      </w:pPr>
-      <w:r>
-        <w:t>Confirm all materials have been correctly placed.</w:t>
-      </w:r>
-    </w:p>
-    <w:p>
-      <w:pPr>
-        <w:numPr>
-          <w:ilvl w:val="0"/>
-          <w:numId w:val="24"/>
-        </w:numPr>
-      </w:pPr>
-      <w:r>
-        <w:t>Check for any missing materials.</w:t>
-      </w:r>
-    </w:p>
-    <w:p>
-      <w:r>
-        <w:rPr>
-          <w:b/>
-          <w:bCs/>
-        </w:rPr>
-        <w:lastRenderedPageBreak/>
-        <w:t>Step 6.2 - Data Recording</w:t>
-      </w:r>
-    </w:p>
-    <w:p>
-      <w:pPr>
-        <w:numPr>
-          <w:ilvl w:val="0"/>
-          <w:numId w:val="25"/>
-        </w:numPr>
-      </w:pPr>
-      <w:r>
-        <w:t>Record task completion time.</w:t>
-      </w:r>
-    </w:p>
-    <w:p>
-      <w:pPr>
-        <w:numPr>
-          <w:ilvl w:val="0"/>
-          <w:numId w:val="25"/>
-        </w:numPr>
-      </w:pPr>
-      <w:r>
-        <w:t>Fill in the operation record sheet.</w:t>
-      </w:r>
-    </w:p>
-    <w:p>
-      <w:pPr>
-        <w:numPr>
-          <w:ilvl w:val="0"/>
-          <w:numId w:val="25"/>
-        </w:numPr>
-      </w:pPr>
-      <w:r>
-        <w:t>Record abnormal situations (if any).</w:t>
-      </w:r>
-    </w:p>
-    <w:p>
-      <w:r>
-        <w:rPr>
-          <w:b/>
-          <w:bCs/>
-        </w:rPr>
-        <w:t>Step 6.3 - Equipment Return to Home</w:t>
-      </w:r>
-    </w:p>
-    <w:p>
-      <w:pPr>
-        <w:numPr>
-          <w:ilvl w:val="0"/>
-          <w:numId w:val="26"/>
-        </w:numPr>
-      </w:pPr>
-      <w:r>
-        <w:t>Navigate to the designated standby area.</w:t>
-      </w:r>
-    </w:p>
-    <w:p>
-      <w:pPr>
-        <w:numPr>
-          <w:ilvl w:val="0"/>
-          <w:numId w:val="26"/>
-        </w:numPr>
-      </w:pPr>
-      <w:r>
-        <w:t>Enter standby mode.</w:t>
-      </w:r>
-    </w:p>
-    <w:p>
-      <w:pPr>
-        <w:numPr>
-          <w:ilvl w:val="0"/>
-          <w:numId w:val="26"/>
-        </w:numPr>
-      </w:pPr>
-      <w:r>
-        <w:t>Await the next operation instruction.</w:t>
-      </w:r>
-    </w:p>
-    <w:p>
-      <w:r>
-        <w:pict w14:anchorId="7B86B474">
-          <v:rect id="_x0000_i1109" style="width:0;height:1.5pt" o:hralign="center" o:hrstd="t" o:hr="t" fillcolor="#a0a0a0" stroked="f"/>
-        </w:pict>
-      </w:r>
-    </w:p>
-    <w:p>
-      <w:r>
-        <w:rPr>
-          <w:b/>
-          <w:bCs/>
-        </w:rPr>
-        <w:t>5. Anomaly Handling Procedures</w:t>
-      </w:r>
-    </w:p>
-    <w:p>
-      <w:r>
-        <w:rPr>
-          <w:b/>
-          <w:bCs/>
-        </w:rPr>
-        <w:t>5.1 Collision Event Handling</w:t>
-      </w:r>
-      <w:r>
-        <w:br/>
-      </w:r>
-      <w:proofErr w:type="spellStart"/>
-      <w:r>
-        <w:rPr>
-          <w:b/>
-          <w:bCs/>
-        </w:rPr>
-        <w:t>Handling</w:t>
-      </w:r>
-      <w:proofErr w:type="spellEnd"/>
-      <w:r>
-        <w:rPr>
-          <w:b/>
-          <w:bCs/>
-        </w:rPr>
-        <w:t xml:space="preserve"> Procedure:</w:t>
-      </w:r>
-    </w:p>
-    <w:p>
-      <w:pPr>
-        <w:numPr>
-          <w:ilvl w:val="0"/>
-          <w:numId w:val="27"/>
-        </w:numPr>
-      </w:pPr>
-      <w:r>
-        <w:rPr>
-          <w:b/>
-          <w:bCs/>
-        </w:rPr>
-        <w:t>Immediate Stop</w:t>
-      </w:r>
-      <w:r>
-        <w:t> - All movements cease immediately.</w:t>
-      </w:r>
-    </w:p>
-    <w:p>
-      <w:pPr>
-        <w:numPr>
-          <w:ilvl w:val="0"/>
-          <w:numId w:val="27"/>
-        </w:numPr>
-      </w:pPr>
-      <w:r>
-        <w:rPr>
-          <w:b/>
-          <w:bCs/>
-        </w:rPr>
-        <w:t>Assess Damage</w:t>
-      </w:r>
-      <w:r>
-        <w:t> - Check equipment and material status.</w:t>
-      </w:r>
-    </w:p>
-    <w:p>
-      <w:pPr>
-        <w:numPr>
-          <w:ilvl w:val="0"/>
-          <w:numId w:val="27"/>
-        </w:numPr>
-      </w:pPr>
-      <w:r>
-        <w:rPr>
-          <w:b/>
-          <w:bCs/>
-        </w:rPr>
-        <w:t>Record Event</w:t>
-      </w:r>
-      <w:r>
-        <w:t> - Fill out an anomaly report form.</w:t>
-      </w:r>
-    </w:p>
-    <w:p>
-      <w:pPr>
-        <w:numPr>
-          <w:ilvl w:val="0"/>
-          <w:numId w:val="27"/>
-        </w:numPr>
-      </w:pPr>
-      <w:r>
-        <w:rPr>
-          <w:b/>
-          <w:bCs/>
-        </w:rPr>
-        <w:t>Report to Supervisor</w:t>
-      </w:r>
-      <w:r>
-        <w:t> - Immediately notify the site supervisor.</w:t>
-      </w:r>
-    </w:p>
-    <w:p>
-      <w:pPr>
-        <w:numPr>
-          <w:ilvl w:val="0"/>
-          <w:numId w:val="27"/>
-        </w:numPr>
-      </w:pPr>
-      <w:r>
-        <w:rPr>
-          <w:b/>
-          <w:bCs/>
-        </w:rPr>
-        <w:t>Await Instructions</w:t>
-      </w:r>
-      <w:r>
-        <w:t> - Continue or stop operations based on supervisor's instructions.</w:t>
-      </w:r>
-    </w:p>
-    <w:p>
-      <w:r>
-        <w:rPr>
-          <w:b/>
-          <w:bCs/>
-        </w:rPr>
-        <w:t>5.2 Material Drop Handling</w:t>
-      </w:r>
-      <w:r>
-        <w:br/>
-      </w:r>
-      <w:proofErr w:type="spellStart"/>
-      <w:r>
-        <w:rPr>
-          <w:b/>
-          <w:bCs/>
-        </w:rPr>
-        <w:t>Handling</w:t>
-      </w:r>
-      <w:proofErr w:type="spellEnd"/>
-      <w:r>
-        <w:rPr>
-          <w:b/>
-          <w:bCs/>
-        </w:rPr>
-        <w:t xml:space="preserve"> Procedure:</w:t>
-      </w:r>
-    </w:p>
-    <w:p>
-      <w:pPr>
-        <w:numPr>
-          <w:ilvl w:val="0"/>
-          <w:numId w:val="28"/>
-        </w:numPr>
-      </w:pPr>
-      <w:r>
-        <w:rPr>
-          <w:b/>
-          <w:bCs/>
-        </w:rPr>
-        <w:t>Stop Operation</w:t>
-      </w:r>
-      <w:r>
-        <w:t> - Suspend the current transfer task.</w:t>
-      </w:r>
-    </w:p>
-    <w:p>
-      <w:pPr>
-        <w:numPr>
-          <w:ilvl w:val="0"/>
-          <w:numId w:val="28"/>
-        </w:numPr>
-      </w:pPr>
-      <w:r>
-        <w:rPr>
-          <w:b/>
-          <w:bCs/>
-        </w:rPr>
-        <w:t>Assess Situation</w:t>
-      </w:r>
-      <w:r>
-        <w:t> - Determine if safe re-grasping is possible.</w:t>
-      </w:r>
-    </w:p>
-    <w:p>
-      <w:pPr>
-        <w:numPr>
-          <w:ilvl w:val="0"/>
-          <w:numId w:val="28"/>
-        </w:numPr>
-      </w:pPr>
-      <w:r>
-        <w:rPr>
-          <w:b/>
-          <w:bCs/>
-        </w:rPr>
-        <w:t>If Conditions Allow</w:t>
-      </w:r>
-      <w:r>
-        <w:t> - Perform re-grasping operation.</w:t>
-      </w:r>
-    </w:p>
-    <w:p>
-      <w:pPr>
-        <w:numPr>
-          <w:ilvl w:val="0"/>
-          <w:numId w:val="28"/>
-        </w:numPr>
-      </w:pPr>
-      <w:r>
-        <w:rPr>
-          <w:b/>
-          <w:bCs/>
-        </w:rPr>
-        <w:t>If Conditions Do Not Allow</w:t>
-      </w:r>
-      <w:r>
-        <w:t> - Report anomaly, await manual handling.</w:t>
-      </w:r>
-    </w:p>
-    <w:p>
-      <w:pPr>
-        <w:numPr>
-          <w:ilvl w:val="0"/>
-          <w:numId w:val="28"/>
-        </w:numPr>
-      </w:pPr>
-      <w:r>
-        <w:rPr>
-          <w:b/>
-          <w:bCs/>
-        </w:rPr>
-        <w:t>Record Event</w:t>
-      </w:r>
-      <w:r>
-        <w:t> - Fill out an anomaly report form.</w:t>
-      </w:r>
-    </w:p>
-    <w:p>
-      <w:r>
-        <w:rPr>
-          <w:b/>
-          <w:bCs/>
-        </w:rPr>
-        <w:t>5.3 Path Obstruction Handling</w:t>
-      </w:r>
-      <w:r>
-        <w:br/>
-      </w:r>
-      <w:proofErr w:type="spellStart"/>
-      <w:r>
-        <w:rPr>
-          <w:b/>
-          <w:bCs/>
-        </w:rPr>
-        <w:t>Handling</w:t>
-      </w:r>
-      <w:proofErr w:type="spellEnd"/>
-      <w:r>
-        <w:rPr>
-          <w:b/>
-          <w:bCs/>
-        </w:rPr>
-        <w:t xml:space="preserve"> Procedure:</w:t>
-      </w:r>
-    </w:p>
-    <w:p>
-      <w:pPr>
-        <w:numPr>
-          <w:ilvl w:val="0"/>
-          <w:numId w:val="29"/>
-        </w:numPr>
-      </w:pPr>
-      <w:r>
-        <w:rPr>
-          <w:b/>
-          <w:bCs/>
-        </w:rPr>
-        <w:lastRenderedPageBreak/>
-        <w:t>Stop Advance</w:t>
-      </w:r>
-      <w:r>
-        <w:t> - Stop at a safe distance.</w:t>
-      </w:r>
-    </w:p>
-    <w:p>
-      <w:pPr>
-        <w:numPr>
-          <w:ilvl w:val="0"/>
-          <w:numId w:val="29"/>
-        </w:numPr>
-      </w:pPr>
-      <w:r>
-        <w:rPr>
-          <w:b/>
-          <w:bCs/>
-        </w:rPr>
-        <w:t>Re-plan</w:t>
-      </w:r>
-      <w:r>
-        <w:t> - Calculate an alternative path.</w:t>
-      </w:r>
-    </w:p>
-    <w:p>
-      <w:pPr>
-        <w:numPr>
-          <w:ilvl w:val="0"/>
-          <w:numId w:val="29"/>
-        </w:numPr>
-      </w:pPr>
-      <w:r>
-        <w:rPr>
-          <w:b/>
-          <w:bCs/>
-        </w:rPr>
-        <w:t>Cannot Detour</w:t>
-      </w:r>
-      <w:r>
-        <w:t> - Report anomaly, await obstacle clearance.</w:t>
-      </w:r>
-    </w:p>
-    <w:p>
-      <w:pPr>
-        <w:numPr>
-          <w:ilvl w:val="0"/>
-          <w:numId w:val="29"/>
-        </w:numPr>
-      </w:pPr>
-      <w:r>
-        <w:rPr>
-          <w:b/>
-          <w:bCs/>
-        </w:rPr>
-        <w:t>Resume Operation</w:t>
-      </w:r>
-      <w:r>
-        <w:t> - Continue after obstacle is cleared.</w:t>
-      </w:r>
-    </w:p>
-    <w:p>
-      <w:r>
-        <w:rPr>
-          <w:b/>
-          <w:bCs/>
-        </w:rPr>
-        <w:t>5.4 SOP Discrepancy with Reality</w:t>
-      </w:r>
-      <w:r>
-        <w:br/>
-      </w:r>
-      <w:r>
-        <w:rPr>
-          <w:b/>
-          <w:bCs/>
-        </w:rPr>
-        <w:t>Handling Procedure:</w:t>
-      </w:r>
-    </w:p>
-    <w:p>
-      <w:pPr>
-        <w:numPr>
-          <w:ilvl w:val="0"/>
-          <w:numId w:val="30"/>
-        </w:numPr>
-      </w:pPr>
-      <w:r>
-        <w:t>Immediately stop operations.</w:t>
-      </w:r>
-    </w:p>
-    <w:p>
-      <w:pPr>
-        <w:numPr>
-          <w:ilvl w:val="0"/>
-          <w:numId w:val="30"/>
-        </w:numPr>
-      </w:pPr>
-      <w:r>
-        <w:t>Report to the site supervisor.</w:t>
-      </w:r>
-    </w:p>
-    <w:p>
-      <w:pPr>
-        <w:numPr>
-          <w:ilvl w:val="0"/>
-          <w:numId w:val="30"/>
-        </w:numPr>
-      </w:pPr>
-      <w:r>
-        <w:t>Describe discrepancies in detail.</w:t>
-      </w:r>
-    </w:p>
-    <w:p>
-      <w:pPr>
-        <w:numPr>
-          <w:ilvl w:val="0"/>
-          <w:numId w:val="30"/>
-        </w:numPr>
-      </w:pPr>
-      <w:r>
-        <w:t>Await SOP update or special instructions.</w:t>
-      </w:r>
-    </w:p>
-    <w:p>
-      <w:pPr>
-        <w:numPr>
-          <w:ilvl w:val="0"/>
-          <w:numId w:val="30"/>
-        </w:numPr>
-      </w:pPr>
-      <w:r>
-        <w:t>Do not unilaterally change operational procedures.</w:t>
-      </w:r>
-    </w:p>
-    <w:p>
-      <w:r>
-        <w:pict w14:anchorId="79C5B09C">
-          <v:rect id="_x0000_i1110" style="width:0;height:1.5pt" o:hralign="center" o:hrstd="t" o:hr="t" fillcolor="#a0a0a0" stroked="f"/>
-        </w:pict>
-      </w:r>
-    </w:p>
-    <w:p>
-      <w:r>
-        <w:rPr>
-          <w:b/>
-          <w:bCs/>
-        </w:rPr>
         <w:t>6. Safety Precautions</w:t>
       </w:r>
     </w:p>
@@ -2588,7 +2606,7 @@
     <w:p>
       <w:r>
         <w:pict w14:anchorId="30155539">
-          <v:rect id="_x0000_i1111" style="width:0;height:1.5pt" o:hralign="center" o:hrstd="t" o:hr="t" fillcolor="#a0a0a0" stroked="f"/>
+          <v:rect id="_x0000_i1033" style="width:0;height:1.5pt" o:hralign="center" o:hrstd="t" o:hr="t" fillcolor="#a0a0a0" stroked="f"/>
         </w:pict>
       </w:r>
     </w:p>
@@ -8575,6 +8593,7 @@
   <w:style w:type="character" w:default="1" w:styleId="DefaultParagraphFont">
     <w:name w:val="Default Paragraph Font"/>
     <w:uiPriority w:val="1"/>
+    <w:semiHidden/>
     <w:unhideWhenUsed/>
   </w:style>
   <w:style w:type="table" w:default="1" w:styleId="TableNormal">

</xml_diff>